<commit_message>
Actualize templates an library
</commit_message>
<xml_diff>
--- a/template/word/wordtemplate.docx
+++ b/template/word/wordtemplate.docx
@@ -1,6 +1,6 @@
 
 <file path=word/document.xml><?xml version="1.0" encoding="utf-8"?>
-<w:document xmlns:wpc="http://schemas.microsoft.com/office/word/2010/wordprocessingCanvas" xmlns:cx="http://schemas.microsoft.com/office/drawing/2014/chartex" xmlns:cx1="http://schemas.microsoft.com/office/drawing/2015/9/8/chartex" xmlns:cx2="http://schemas.microsoft.com/office/drawing/2015/10/21/chartex" xmlns:cx3="http://schemas.microsoft.com/office/drawing/2016/5/9/chartex" xmlns:cx4="http://schemas.microsoft.com/office/drawing/2016/5/10/chartex" xmlns:cx5="http://schemas.microsoft.com/office/drawing/2016/5/11/chartex" xmlns:cx6="http://schemas.microsoft.com/office/drawing/2016/5/12/chartex" xmlns:cx7="http://schemas.microsoft.com/office/drawing/2016/5/13/chartex" xmlns:cx8="http://schemas.microsoft.com/office/drawing/2016/5/14/chartex" xmlns:mc="http://schemas.openxmlformats.org/markup-compatibility/2006" xmlns:aink="http://schemas.microsoft.com/office/drawing/2016/ink" xmlns:am3d="http://schemas.microsoft.com/office/drawing/2017/model3d" xmlns:o="urn:schemas-microsoft-com:office:office" xmlns:oel="http://schemas.microsoft.com/office/2019/extlst" xmlns:r="http://schemas.openxmlformats.org/officeDocument/2006/relationships" xmlns:m="http://schemas.openxmlformats.org/officeDocument/2006/math" xmlns:v="urn:schemas-microsoft-com:vml" xmlns:wp14="http://schemas.microsoft.com/office/word/2010/wordprocessingDrawing" xmlns:wp="http://schemas.openxmlformats.org/drawingml/2006/wordprocessingDrawing" xmlns:w10="urn:schemas-microsoft-com:office:word" xmlns:w="http://schemas.openxmlformats.org/wordprocessingml/2006/main" xmlns:w14="http://schemas.microsoft.com/office/word/2010/wordml" xmlns:w15="http://schemas.microsoft.com/office/word/2012/wordml" xmlns:w16cex="http://schemas.microsoft.com/office/word/2018/wordml/cex" xmlns:w16cid="http://schemas.microsoft.com/office/word/2016/wordml/cid" xmlns:w16="http://schemas.microsoft.com/office/word/2018/wordml" xmlns:w16sdtdh="http://schemas.microsoft.com/office/word/2020/wordml/sdtdatahash" xmlns:w16se="http://schemas.microsoft.com/office/word/2015/wordml/symex" xmlns:wpg="http://schemas.microsoft.com/office/word/2010/wordprocessingGroup" xmlns:wpi="http://schemas.microsoft.com/office/word/2010/wordprocessingInk" xmlns:wne="http://schemas.microsoft.com/office/word/2006/wordml" xmlns:wps="http://schemas.microsoft.com/office/word/2010/wordprocessingShape" mc:Ignorable="w14 w15 w16se w16cid w16 w16cex w16sdtdh wp14">
+<w:document xmlns:wpc="http://schemas.microsoft.com/office/word/2010/wordprocessingCanvas" xmlns:cx="http://schemas.microsoft.com/office/drawing/2014/chartex" xmlns:cx1="http://schemas.microsoft.com/office/drawing/2015/9/8/chartex" xmlns:cx2="http://schemas.microsoft.com/office/drawing/2015/10/21/chartex" xmlns:cx3="http://schemas.microsoft.com/office/drawing/2016/5/9/chartex" xmlns:cx4="http://schemas.microsoft.com/office/drawing/2016/5/10/chartex" xmlns:cx5="http://schemas.microsoft.com/office/drawing/2016/5/11/chartex" xmlns:cx6="http://schemas.microsoft.com/office/drawing/2016/5/12/chartex" xmlns:cx7="http://schemas.microsoft.com/office/drawing/2016/5/13/chartex" xmlns:cx8="http://schemas.microsoft.com/office/drawing/2016/5/14/chartex" xmlns:mc="http://schemas.openxmlformats.org/markup-compatibility/2006" xmlns:aink="http://schemas.microsoft.com/office/drawing/2016/ink" xmlns:am3d="http://schemas.microsoft.com/office/drawing/2017/model3d" xmlns:o="urn:schemas-microsoft-com:office:office" xmlns:r="http://schemas.openxmlformats.org/officeDocument/2006/relationships" xmlns:m="http://schemas.openxmlformats.org/officeDocument/2006/math" xmlns:v="urn:schemas-microsoft-com:vml" xmlns:wp14="http://schemas.microsoft.com/office/word/2010/wordprocessingDrawing" xmlns:wp="http://schemas.openxmlformats.org/drawingml/2006/wordprocessingDrawing" xmlns:w10="urn:schemas-microsoft-com:office:word" xmlns:w="http://schemas.openxmlformats.org/wordprocessingml/2006/main" xmlns:w14="http://schemas.microsoft.com/office/word/2010/wordml" xmlns:w15="http://schemas.microsoft.com/office/word/2012/wordml" xmlns:w16cex="http://schemas.microsoft.com/office/word/2018/wordml/cex" xmlns:w16cid="http://schemas.microsoft.com/office/word/2016/wordml/cid" xmlns:w16="http://schemas.microsoft.com/office/word/2018/wordml" xmlns:w16sdtdh="http://schemas.microsoft.com/office/word/2020/wordml/sdtdatahash" xmlns:w16se="http://schemas.microsoft.com/office/word/2015/wordml/symex" xmlns:wpg="http://schemas.microsoft.com/office/word/2010/wordprocessingGroup" xmlns:wpi="http://schemas.microsoft.com/office/word/2010/wordprocessingInk" xmlns:wne="http://schemas.microsoft.com/office/word/2006/wordml" xmlns:wps="http://schemas.microsoft.com/office/word/2010/wordprocessingShape" mc:Ignorable="w14 w15 w16se w16cid w16 w16cex w16sdtdh wp14">
   <w:body>
     <w:p>
       <w:pPr>
@@ -44,6 +44,7 @@
       </w:sdtPr>
       <w:sdtEndPr>
         <w:rPr>
+          <w:rFonts w:ascii="Alegreya Sans" w:hAnsi="Alegreya Sans"/>
           <w:b/>
           <w:bCs/>
         </w:rPr>
@@ -4735,7 +4736,7 @@
 </file>
 
 <file path=word/endnotes.xml><?xml version="1.0" encoding="utf-8"?>
-<w:endnotes xmlns:wpc="http://schemas.microsoft.com/office/word/2010/wordprocessingCanvas" xmlns:cx="http://schemas.microsoft.com/office/drawing/2014/chartex" xmlns:cx1="http://schemas.microsoft.com/office/drawing/2015/9/8/chartex" xmlns:cx2="http://schemas.microsoft.com/office/drawing/2015/10/21/chartex" xmlns:cx3="http://schemas.microsoft.com/office/drawing/2016/5/9/chartex" xmlns:cx4="http://schemas.microsoft.com/office/drawing/2016/5/10/chartex" xmlns:cx5="http://schemas.microsoft.com/office/drawing/2016/5/11/chartex" xmlns:cx6="http://schemas.microsoft.com/office/drawing/2016/5/12/chartex" xmlns:cx7="http://schemas.microsoft.com/office/drawing/2016/5/13/chartex" xmlns:cx8="http://schemas.microsoft.com/office/drawing/2016/5/14/chartex" xmlns:mc="http://schemas.openxmlformats.org/markup-compatibility/2006" xmlns:aink="http://schemas.microsoft.com/office/drawing/2016/ink" xmlns:am3d="http://schemas.microsoft.com/office/drawing/2017/model3d" xmlns:o="urn:schemas-microsoft-com:office:office" xmlns:oel="http://schemas.microsoft.com/office/2019/extlst" xmlns:r="http://schemas.openxmlformats.org/officeDocument/2006/relationships" xmlns:m="http://schemas.openxmlformats.org/officeDocument/2006/math" xmlns:v="urn:schemas-microsoft-com:vml" xmlns:wp14="http://schemas.microsoft.com/office/word/2010/wordprocessingDrawing" xmlns:wp="http://schemas.openxmlformats.org/drawingml/2006/wordprocessingDrawing" xmlns:w10="urn:schemas-microsoft-com:office:word" xmlns:w="http://schemas.openxmlformats.org/wordprocessingml/2006/main" xmlns:w14="http://schemas.microsoft.com/office/word/2010/wordml" xmlns:w15="http://schemas.microsoft.com/office/word/2012/wordml" xmlns:w16cex="http://schemas.microsoft.com/office/word/2018/wordml/cex" xmlns:w16cid="http://schemas.microsoft.com/office/word/2016/wordml/cid" xmlns:w16="http://schemas.microsoft.com/office/word/2018/wordml" xmlns:w16sdtdh="http://schemas.microsoft.com/office/word/2020/wordml/sdtdatahash" xmlns:w16se="http://schemas.microsoft.com/office/word/2015/wordml/symex" xmlns:wpg="http://schemas.microsoft.com/office/word/2010/wordprocessingGroup" xmlns:wpi="http://schemas.microsoft.com/office/word/2010/wordprocessingInk" xmlns:wne="http://schemas.microsoft.com/office/word/2006/wordml" xmlns:wps="http://schemas.microsoft.com/office/word/2010/wordprocessingShape" mc:Ignorable="w14 w15 w16se w16cid w16 w16cex w16sdtdh wp14">
+<w:endnotes xmlns:wpc="http://schemas.microsoft.com/office/word/2010/wordprocessingCanvas" xmlns:cx="http://schemas.microsoft.com/office/drawing/2014/chartex" xmlns:cx1="http://schemas.microsoft.com/office/drawing/2015/9/8/chartex" xmlns:cx2="http://schemas.microsoft.com/office/drawing/2015/10/21/chartex" xmlns:cx3="http://schemas.microsoft.com/office/drawing/2016/5/9/chartex" xmlns:cx4="http://schemas.microsoft.com/office/drawing/2016/5/10/chartex" xmlns:cx5="http://schemas.microsoft.com/office/drawing/2016/5/11/chartex" xmlns:cx6="http://schemas.microsoft.com/office/drawing/2016/5/12/chartex" xmlns:cx7="http://schemas.microsoft.com/office/drawing/2016/5/13/chartex" xmlns:cx8="http://schemas.microsoft.com/office/drawing/2016/5/14/chartex" xmlns:mc="http://schemas.openxmlformats.org/markup-compatibility/2006" xmlns:aink="http://schemas.microsoft.com/office/drawing/2016/ink" xmlns:am3d="http://schemas.microsoft.com/office/drawing/2017/model3d" xmlns:o="urn:schemas-microsoft-com:office:office" xmlns:r="http://schemas.openxmlformats.org/officeDocument/2006/relationships" xmlns:m="http://schemas.openxmlformats.org/officeDocument/2006/math" xmlns:v="urn:schemas-microsoft-com:vml" xmlns:wp14="http://schemas.microsoft.com/office/word/2010/wordprocessingDrawing" xmlns:wp="http://schemas.openxmlformats.org/drawingml/2006/wordprocessingDrawing" xmlns:w10="urn:schemas-microsoft-com:office:word" xmlns:w="http://schemas.openxmlformats.org/wordprocessingml/2006/main" xmlns:w14="http://schemas.microsoft.com/office/word/2010/wordml" xmlns:w15="http://schemas.microsoft.com/office/word/2012/wordml" xmlns:w16cex="http://schemas.microsoft.com/office/word/2018/wordml/cex" xmlns:w16cid="http://schemas.microsoft.com/office/word/2016/wordml/cid" xmlns:w16="http://schemas.microsoft.com/office/word/2018/wordml" xmlns:w16sdtdh="http://schemas.microsoft.com/office/word/2020/wordml/sdtdatahash" xmlns:w16se="http://schemas.microsoft.com/office/word/2015/wordml/symex" xmlns:wpg="http://schemas.microsoft.com/office/word/2010/wordprocessingGroup" xmlns:wpi="http://schemas.microsoft.com/office/word/2010/wordprocessingInk" xmlns:wne="http://schemas.microsoft.com/office/word/2006/wordml" xmlns:wps="http://schemas.microsoft.com/office/word/2010/wordprocessingShape" mc:Ignorable="w14 w15 w16se w16cid w16 w16cex w16sdtdh wp14">
   <w:endnote w:type="separator" w:id="-1">
     <w:p>
       <w:pPr>
@@ -4760,7 +4761,7 @@
 </file>
 
 <file path=word/footer1.xml><?xml version="1.0" encoding="utf-8"?>
-<w:ftr xmlns:wpc="http://schemas.microsoft.com/office/word/2010/wordprocessingCanvas" xmlns:cx="http://schemas.microsoft.com/office/drawing/2014/chartex" xmlns:cx1="http://schemas.microsoft.com/office/drawing/2015/9/8/chartex" xmlns:cx2="http://schemas.microsoft.com/office/drawing/2015/10/21/chartex" xmlns:cx3="http://schemas.microsoft.com/office/drawing/2016/5/9/chartex" xmlns:cx4="http://schemas.microsoft.com/office/drawing/2016/5/10/chartex" xmlns:cx5="http://schemas.microsoft.com/office/drawing/2016/5/11/chartex" xmlns:cx6="http://schemas.microsoft.com/office/drawing/2016/5/12/chartex" xmlns:cx7="http://schemas.microsoft.com/office/drawing/2016/5/13/chartex" xmlns:cx8="http://schemas.microsoft.com/office/drawing/2016/5/14/chartex" xmlns:mc="http://schemas.openxmlformats.org/markup-compatibility/2006" xmlns:aink="http://schemas.microsoft.com/office/drawing/2016/ink" xmlns:am3d="http://schemas.microsoft.com/office/drawing/2017/model3d" xmlns:o="urn:schemas-microsoft-com:office:office" xmlns:oel="http://schemas.microsoft.com/office/2019/extlst" xmlns:r="http://schemas.openxmlformats.org/officeDocument/2006/relationships" xmlns:m="http://schemas.openxmlformats.org/officeDocument/2006/math" xmlns:v="urn:schemas-microsoft-com:vml" xmlns:wp14="http://schemas.microsoft.com/office/word/2010/wordprocessingDrawing" xmlns:wp="http://schemas.openxmlformats.org/drawingml/2006/wordprocessingDrawing" xmlns:w10="urn:schemas-microsoft-com:office:word" xmlns:w="http://schemas.openxmlformats.org/wordprocessingml/2006/main" xmlns:w14="http://schemas.microsoft.com/office/word/2010/wordml" xmlns:w15="http://schemas.microsoft.com/office/word/2012/wordml" xmlns:w16cex="http://schemas.microsoft.com/office/word/2018/wordml/cex" xmlns:w16cid="http://schemas.microsoft.com/office/word/2016/wordml/cid" xmlns:w16="http://schemas.microsoft.com/office/word/2018/wordml" xmlns:w16sdtdh="http://schemas.microsoft.com/office/word/2020/wordml/sdtdatahash" xmlns:w16se="http://schemas.microsoft.com/office/word/2015/wordml/symex" xmlns:wpg="http://schemas.microsoft.com/office/word/2010/wordprocessingGroup" xmlns:wpi="http://schemas.microsoft.com/office/word/2010/wordprocessingInk" xmlns:wne="http://schemas.microsoft.com/office/word/2006/wordml" xmlns:wps="http://schemas.microsoft.com/office/word/2010/wordprocessingShape" mc:Ignorable="w14 w15 w16se w16cid w16 w16cex w16sdtdh wp14">
+<w:ftr xmlns:wpc="http://schemas.microsoft.com/office/word/2010/wordprocessingCanvas" xmlns:cx="http://schemas.microsoft.com/office/drawing/2014/chartex" xmlns:cx1="http://schemas.microsoft.com/office/drawing/2015/9/8/chartex" xmlns:cx2="http://schemas.microsoft.com/office/drawing/2015/10/21/chartex" xmlns:cx3="http://schemas.microsoft.com/office/drawing/2016/5/9/chartex" xmlns:cx4="http://schemas.microsoft.com/office/drawing/2016/5/10/chartex" xmlns:cx5="http://schemas.microsoft.com/office/drawing/2016/5/11/chartex" xmlns:cx6="http://schemas.microsoft.com/office/drawing/2016/5/12/chartex" xmlns:cx7="http://schemas.microsoft.com/office/drawing/2016/5/13/chartex" xmlns:cx8="http://schemas.microsoft.com/office/drawing/2016/5/14/chartex" xmlns:mc="http://schemas.openxmlformats.org/markup-compatibility/2006" xmlns:aink="http://schemas.microsoft.com/office/drawing/2016/ink" xmlns:am3d="http://schemas.microsoft.com/office/drawing/2017/model3d" xmlns:o="urn:schemas-microsoft-com:office:office" xmlns:r="http://schemas.openxmlformats.org/officeDocument/2006/relationships" xmlns:m="http://schemas.openxmlformats.org/officeDocument/2006/math" xmlns:v="urn:schemas-microsoft-com:vml" xmlns:wp14="http://schemas.microsoft.com/office/word/2010/wordprocessingDrawing" xmlns:wp="http://schemas.openxmlformats.org/drawingml/2006/wordprocessingDrawing" xmlns:w10="urn:schemas-microsoft-com:office:word" xmlns:w="http://schemas.openxmlformats.org/wordprocessingml/2006/main" xmlns:w14="http://schemas.microsoft.com/office/word/2010/wordml" xmlns:w15="http://schemas.microsoft.com/office/word/2012/wordml" xmlns:w16cex="http://schemas.microsoft.com/office/word/2018/wordml/cex" xmlns:w16cid="http://schemas.microsoft.com/office/word/2016/wordml/cid" xmlns:w16="http://schemas.microsoft.com/office/word/2018/wordml" xmlns:w16sdtdh="http://schemas.microsoft.com/office/word/2020/wordml/sdtdatahash" xmlns:w16se="http://schemas.microsoft.com/office/word/2015/wordml/symex" xmlns:wpg="http://schemas.microsoft.com/office/word/2010/wordprocessingGroup" xmlns:wpi="http://schemas.microsoft.com/office/word/2010/wordprocessingInk" xmlns:wne="http://schemas.microsoft.com/office/word/2006/wordml" xmlns:wps="http://schemas.microsoft.com/office/word/2010/wordprocessingShape" mc:Ignorable="w14 w15 w16se w16cid w16 w16cex w16sdtdh wp14">
   <w:sdt>
     <w:sdtPr>
       <w:rPr>
@@ -4830,7 +4831,7 @@
 </file>
 
 <file path=word/footer2.xml><?xml version="1.0" encoding="utf-8"?>
-<w:ftr xmlns:wpc="http://schemas.microsoft.com/office/word/2010/wordprocessingCanvas" xmlns:cx="http://schemas.microsoft.com/office/drawing/2014/chartex" xmlns:cx1="http://schemas.microsoft.com/office/drawing/2015/9/8/chartex" xmlns:cx2="http://schemas.microsoft.com/office/drawing/2015/10/21/chartex" xmlns:cx3="http://schemas.microsoft.com/office/drawing/2016/5/9/chartex" xmlns:cx4="http://schemas.microsoft.com/office/drawing/2016/5/10/chartex" xmlns:cx5="http://schemas.microsoft.com/office/drawing/2016/5/11/chartex" xmlns:cx6="http://schemas.microsoft.com/office/drawing/2016/5/12/chartex" xmlns:cx7="http://schemas.microsoft.com/office/drawing/2016/5/13/chartex" xmlns:cx8="http://schemas.microsoft.com/office/drawing/2016/5/14/chartex" xmlns:mc="http://schemas.openxmlformats.org/markup-compatibility/2006" xmlns:aink="http://schemas.microsoft.com/office/drawing/2016/ink" xmlns:am3d="http://schemas.microsoft.com/office/drawing/2017/model3d" xmlns:o="urn:schemas-microsoft-com:office:office" xmlns:oel="http://schemas.microsoft.com/office/2019/extlst" xmlns:r="http://schemas.openxmlformats.org/officeDocument/2006/relationships" xmlns:m="http://schemas.openxmlformats.org/officeDocument/2006/math" xmlns:v="urn:schemas-microsoft-com:vml" xmlns:wp14="http://schemas.microsoft.com/office/word/2010/wordprocessingDrawing" xmlns:wp="http://schemas.openxmlformats.org/drawingml/2006/wordprocessingDrawing" xmlns:w10="urn:schemas-microsoft-com:office:word" xmlns:w="http://schemas.openxmlformats.org/wordprocessingml/2006/main" xmlns:w14="http://schemas.microsoft.com/office/word/2010/wordml" xmlns:w15="http://schemas.microsoft.com/office/word/2012/wordml" xmlns:w16cex="http://schemas.microsoft.com/office/word/2018/wordml/cex" xmlns:w16cid="http://schemas.microsoft.com/office/word/2016/wordml/cid" xmlns:w16="http://schemas.microsoft.com/office/word/2018/wordml" xmlns:w16sdtdh="http://schemas.microsoft.com/office/word/2020/wordml/sdtdatahash" xmlns:w16se="http://schemas.microsoft.com/office/word/2015/wordml/symex" xmlns:wpg="http://schemas.microsoft.com/office/word/2010/wordprocessingGroup" xmlns:wpi="http://schemas.microsoft.com/office/word/2010/wordprocessingInk" xmlns:wne="http://schemas.microsoft.com/office/word/2006/wordml" xmlns:wps="http://schemas.microsoft.com/office/word/2010/wordprocessingShape" mc:Ignorable="w14 w15 w16se w16cid w16 w16cex w16sdtdh wp14">
+<w:ftr xmlns:wpc="http://schemas.microsoft.com/office/word/2010/wordprocessingCanvas" xmlns:cx="http://schemas.microsoft.com/office/drawing/2014/chartex" xmlns:cx1="http://schemas.microsoft.com/office/drawing/2015/9/8/chartex" xmlns:cx2="http://schemas.microsoft.com/office/drawing/2015/10/21/chartex" xmlns:cx3="http://schemas.microsoft.com/office/drawing/2016/5/9/chartex" xmlns:cx4="http://schemas.microsoft.com/office/drawing/2016/5/10/chartex" xmlns:cx5="http://schemas.microsoft.com/office/drawing/2016/5/11/chartex" xmlns:cx6="http://schemas.microsoft.com/office/drawing/2016/5/12/chartex" xmlns:cx7="http://schemas.microsoft.com/office/drawing/2016/5/13/chartex" xmlns:cx8="http://schemas.microsoft.com/office/drawing/2016/5/14/chartex" xmlns:mc="http://schemas.openxmlformats.org/markup-compatibility/2006" xmlns:aink="http://schemas.microsoft.com/office/drawing/2016/ink" xmlns:am3d="http://schemas.microsoft.com/office/drawing/2017/model3d" xmlns:o="urn:schemas-microsoft-com:office:office" xmlns:r="http://schemas.openxmlformats.org/officeDocument/2006/relationships" xmlns:m="http://schemas.openxmlformats.org/officeDocument/2006/math" xmlns:v="urn:schemas-microsoft-com:vml" xmlns:wp14="http://schemas.microsoft.com/office/word/2010/wordprocessingDrawing" xmlns:wp="http://schemas.openxmlformats.org/drawingml/2006/wordprocessingDrawing" xmlns:w10="urn:schemas-microsoft-com:office:word" xmlns:w="http://schemas.openxmlformats.org/wordprocessingml/2006/main" xmlns:w14="http://schemas.microsoft.com/office/word/2010/wordml" xmlns:w15="http://schemas.microsoft.com/office/word/2012/wordml" xmlns:w16cex="http://schemas.microsoft.com/office/word/2018/wordml/cex" xmlns:w16cid="http://schemas.microsoft.com/office/word/2016/wordml/cid" xmlns:w16="http://schemas.microsoft.com/office/word/2018/wordml" xmlns:w16sdtdh="http://schemas.microsoft.com/office/word/2020/wordml/sdtdatahash" xmlns:w16se="http://schemas.microsoft.com/office/word/2015/wordml/symex" xmlns:wpg="http://schemas.microsoft.com/office/word/2010/wordprocessingGroup" xmlns:wpi="http://schemas.microsoft.com/office/word/2010/wordprocessingInk" xmlns:wne="http://schemas.microsoft.com/office/word/2006/wordml" xmlns:wps="http://schemas.microsoft.com/office/word/2010/wordprocessingShape" mc:Ignorable="w14 w15 w16se w16cid w16 w16cex w16sdtdh wp14">
   <w:sdt>
     <w:sdtPr>
       <w:rPr>
@@ -4900,7 +4901,7 @@
 </file>
 
 <file path=word/footnotes.xml><?xml version="1.0" encoding="utf-8"?>
-<w:footnotes xmlns:wpc="http://schemas.microsoft.com/office/word/2010/wordprocessingCanvas" xmlns:cx="http://schemas.microsoft.com/office/drawing/2014/chartex" xmlns:cx1="http://schemas.microsoft.com/office/drawing/2015/9/8/chartex" xmlns:cx2="http://schemas.microsoft.com/office/drawing/2015/10/21/chartex" xmlns:cx3="http://schemas.microsoft.com/office/drawing/2016/5/9/chartex" xmlns:cx4="http://schemas.microsoft.com/office/drawing/2016/5/10/chartex" xmlns:cx5="http://schemas.microsoft.com/office/drawing/2016/5/11/chartex" xmlns:cx6="http://schemas.microsoft.com/office/drawing/2016/5/12/chartex" xmlns:cx7="http://schemas.microsoft.com/office/drawing/2016/5/13/chartex" xmlns:cx8="http://schemas.microsoft.com/office/drawing/2016/5/14/chartex" xmlns:mc="http://schemas.openxmlformats.org/markup-compatibility/2006" xmlns:aink="http://schemas.microsoft.com/office/drawing/2016/ink" xmlns:am3d="http://schemas.microsoft.com/office/drawing/2017/model3d" xmlns:o="urn:schemas-microsoft-com:office:office" xmlns:oel="http://schemas.microsoft.com/office/2019/extlst" xmlns:r="http://schemas.openxmlformats.org/officeDocument/2006/relationships" xmlns:m="http://schemas.openxmlformats.org/officeDocument/2006/math" xmlns:v="urn:schemas-microsoft-com:vml" xmlns:wp14="http://schemas.microsoft.com/office/word/2010/wordprocessingDrawing" xmlns:wp="http://schemas.openxmlformats.org/drawingml/2006/wordprocessingDrawing" xmlns:w10="urn:schemas-microsoft-com:office:word" xmlns:w="http://schemas.openxmlformats.org/wordprocessingml/2006/main" xmlns:w14="http://schemas.microsoft.com/office/word/2010/wordml" xmlns:w15="http://schemas.microsoft.com/office/word/2012/wordml" xmlns:w16cex="http://schemas.microsoft.com/office/word/2018/wordml/cex" xmlns:w16cid="http://schemas.microsoft.com/office/word/2016/wordml/cid" xmlns:w16="http://schemas.microsoft.com/office/word/2018/wordml" xmlns:w16sdtdh="http://schemas.microsoft.com/office/word/2020/wordml/sdtdatahash" xmlns:w16se="http://schemas.microsoft.com/office/word/2015/wordml/symex" xmlns:wpg="http://schemas.microsoft.com/office/word/2010/wordprocessingGroup" xmlns:wpi="http://schemas.microsoft.com/office/word/2010/wordprocessingInk" xmlns:wne="http://schemas.microsoft.com/office/word/2006/wordml" xmlns:wps="http://schemas.microsoft.com/office/word/2010/wordprocessingShape" mc:Ignorable="w14 w15 w16se w16cid w16 w16cex w16sdtdh wp14">
+<w:footnotes xmlns:wpc="http://schemas.microsoft.com/office/word/2010/wordprocessingCanvas" xmlns:cx="http://schemas.microsoft.com/office/drawing/2014/chartex" xmlns:cx1="http://schemas.microsoft.com/office/drawing/2015/9/8/chartex" xmlns:cx2="http://schemas.microsoft.com/office/drawing/2015/10/21/chartex" xmlns:cx3="http://schemas.microsoft.com/office/drawing/2016/5/9/chartex" xmlns:cx4="http://schemas.microsoft.com/office/drawing/2016/5/10/chartex" xmlns:cx5="http://schemas.microsoft.com/office/drawing/2016/5/11/chartex" xmlns:cx6="http://schemas.microsoft.com/office/drawing/2016/5/12/chartex" xmlns:cx7="http://schemas.microsoft.com/office/drawing/2016/5/13/chartex" xmlns:cx8="http://schemas.microsoft.com/office/drawing/2016/5/14/chartex" xmlns:mc="http://schemas.openxmlformats.org/markup-compatibility/2006" xmlns:aink="http://schemas.microsoft.com/office/drawing/2016/ink" xmlns:am3d="http://schemas.microsoft.com/office/drawing/2017/model3d" xmlns:o="urn:schemas-microsoft-com:office:office" xmlns:r="http://schemas.openxmlformats.org/officeDocument/2006/relationships" xmlns:m="http://schemas.openxmlformats.org/officeDocument/2006/math" xmlns:v="urn:schemas-microsoft-com:vml" xmlns:wp14="http://schemas.microsoft.com/office/word/2010/wordprocessingDrawing" xmlns:wp="http://schemas.openxmlformats.org/drawingml/2006/wordprocessingDrawing" xmlns:w10="urn:schemas-microsoft-com:office:word" xmlns:w="http://schemas.openxmlformats.org/wordprocessingml/2006/main" xmlns:w14="http://schemas.microsoft.com/office/word/2010/wordml" xmlns:w15="http://schemas.microsoft.com/office/word/2012/wordml" xmlns:w16cex="http://schemas.microsoft.com/office/word/2018/wordml/cex" xmlns:w16cid="http://schemas.microsoft.com/office/word/2016/wordml/cid" xmlns:w16="http://schemas.microsoft.com/office/word/2018/wordml" xmlns:w16sdtdh="http://schemas.microsoft.com/office/word/2020/wordml/sdtdatahash" xmlns:w16se="http://schemas.microsoft.com/office/word/2015/wordml/symex" xmlns:wpg="http://schemas.microsoft.com/office/word/2010/wordprocessingGroup" xmlns:wpi="http://schemas.microsoft.com/office/word/2010/wordprocessingInk" xmlns:wne="http://schemas.microsoft.com/office/word/2006/wordml" xmlns:wps="http://schemas.microsoft.com/office/word/2010/wordprocessingShape" mc:Ignorable="w14 w15 w16se w16cid w16 w16cex w16sdtdh wp14">
   <w:footnote w:type="separator" w:id="-1">
     <w:p>
       <w:r>
@@ -4939,11 +4940,11 @@
 </file>
 
 <file path=word/numbering.xml><?xml version="1.0" encoding="utf-8"?>
-<w:numbering xmlns:wpc="http://schemas.microsoft.com/office/word/2010/wordprocessingCanvas" xmlns:cx="http://schemas.microsoft.com/office/drawing/2014/chartex" xmlns:cx1="http://schemas.microsoft.com/office/drawing/2015/9/8/chartex" xmlns:cx2="http://schemas.microsoft.com/office/drawing/2015/10/21/chartex" xmlns:cx3="http://schemas.microsoft.com/office/drawing/2016/5/9/chartex" xmlns:cx4="http://schemas.microsoft.com/office/drawing/2016/5/10/chartex" xmlns:cx5="http://schemas.microsoft.com/office/drawing/2016/5/11/chartex" xmlns:cx6="http://schemas.microsoft.com/office/drawing/2016/5/12/chartex" xmlns:cx7="http://schemas.microsoft.com/office/drawing/2016/5/13/chartex" xmlns:cx8="http://schemas.microsoft.com/office/drawing/2016/5/14/chartex" xmlns:mc="http://schemas.openxmlformats.org/markup-compatibility/2006" xmlns:aink="http://schemas.microsoft.com/office/drawing/2016/ink" xmlns:am3d="http://schemas.microsoft.com/office/drawing/2017/model3d" xmlns:o="urn:schemas-microsoft-com:office:office" xmlns:oel="http://schemas.microsoft.com/office/2019/extlst" xmlns:r="http://schemas.openxmlformats.org/officeDocument/2006/relationships" xmlns:m="http://schemas.openxmlformats.org/officeDocument/2006/math" xmlns:v="urn:schemas-microsoft-com:vml" xmlns:wp14="http://schemas.microsoft.com/office/word/2010/wordprocessingDrawing" xmlns:wp="http://schemas.openxmlformats.org/drawingml/2006/wordprocessingDrawing" xmlns:w10="urn:schemas-microsoft-com:office:word" xmlns:w="http://schemas.openxmlformats.org/wordprocessingml/2006/main" xmlns:w14="http://schemas.microsoft.com/office/word/2010/wordml" xmlns:w15="http://schemas.microsoft.com/office/word/2012/wordml" xmlns:w16cex="http://schemas.microsoft.com/office/word/2018/wordml/cex" xmlns:w16cid="http://schemas.microsoft.com/office/word/2016/wordml/cid" xmlns:w16="http://schemas.microsoft.com/office/word/2018/wordml" xmlns:w16sdtdh="http://schemas.microsoft.com/office/word/2020/wordml/sdtdatahash" xmlns:w16se="http://schemas.microsoft.com/office/word/2015/wordml/symex" xmlns:wpg="http://schemas.microsoft.com/office/word/2010/wordprocessingGroup" xmlns:wpi="http://schemas.microsoft.com/office/word/2010/wordprocessingInk" xmlns:wne="http://schemas.microsoft.com/office/word/2006/wordml" xmlns:wps="http://schemas.microsoft.com/office/word/2010/wordprocessingShape" mc:Ignorable="w14 w15 w16se w16cid w16 w16cex w16sdtdh wp14">
+<w:numbering xmlns:wpc="http://schemas.microsoft.com/office/word/2010/wordprocessingCanvas" xmlns:cx="http://schemas.microsoft.com/office/drawing/2014/chartex" xmlns:cx1="http://schemas.microsoft.com/office/drawing/2015/9/8/chartex" xmlns:cx2="http://schemas.microsoft.com/office/drawing/2015/10/21/chartex" xmlns:cx3="http://schemas.microsoft.com/office/drawing/2016/5/9/chartex" xmlns:cx4="http://schemas.microsoft.com/office/drawing/2016/5/10/chartex" xmlns:cx5="http://schemas.microsoft.com/office/drawing/2016/5/11/chartex" xmlns:cx6="http://schemas.microsoft.com/office/drawing/2016/5/12/chartex" xmlns:cx7="http://schemas.microsoft.com/office/drawing/2016/5/13/chartex" xmlns:cx8="http://schemas.microsoft.com/office/drawing/2016/5/14/chartex" xmlns:mc="http://schemas.openxmlformats.org/markup-compatibility/2006" xmlns:aink="http://schemas.microsoft.com/office/drawing/2016/ink" xmlns:am3d="http://schemas.microsoft.com/office/drawing/2017/model3d" xmlns:o="urn:schemas-microsoft-com:office:office" xmlns:r="http://schemas.openxmlformats.org/officeDocument/2006/relationships" xmlns:m="http://schemas.openxmlformats.org/officeDocument/2006/math" xmlns:v="urn:schemas-microsoft-com:vml" xmlns:wp14="http://schemas.microsoft.com/office/word/2010/wordprocessingDrawing" xmlns:wp="http://schemas.openxmlformats.org/drawingml/2006/wordprocessingDrawing" xmlns:w10="urn:schemas-microsoft-com:office:word" xmlns:w="http://schemas.openxmlformats.org/wordprocessingml/2006/main" xmlns:w14="http://schemas.microsoft.com/office/word/2010/wordml" xmlns:w15="http://schemas.microsoft.com/office/word/2012/wordml" xmlns:w16cex="http://schemas.microsoft.com/office/word/2018/wordml/cex" xmlns:w16cid="http://schemas.microsoft.com/office/word/2016/wordml/cid" xmlns:w16="http://schemas.microsoft.com/office/word/2018/wordml" xmlns:w16sdtdh="http://schemas.microsoft.com/office/word/2020/wordml/sdtdatahash" xmlns:w16se="http://schemas.microsoft.com/office/word/2015/wordml/symex" xmlns:wpg="http://schemas.microsoft.com/office/word/2010/wordprocessingGroup" xmlns:wpi="http://schemas.microsoft.com/office/word/2010/wordprocessingInk" xmlns:wne="http://schemas.microsoft.com/office/word/2006/wordml" xmlns:wps="http://schemas.microsoft.com/office/word/2010/wordprocessingShape" mc:Ignorable="w14 w15 w16se w16cid w16 w16cex w16sdtdh wp14">
   <w:abstractNum w:abstractNumId="0" w15:restartNumberingAfterBreak="0">
     <w:nsid w:val="FFFFFF7C"/>
     <w:multiLevelType w:val="singleLevel"/>
-    <w:tmpl w:val="72BCF93C"/>
+    <w:tmpl w:val="C56092D6"/>
     <w:lvl w:ilvl="0">
       <w:start w:val="1"/>
       <w:numFmt w:val="decimal"/>
@@ -4960,7 +4961,7 @@
   <w:abstractNum w:abstractNumId="1" w15:restartNumberingAfterBreak="0">
     <w:nsid w:val="FFFFFF7D"/>
     <w:multiLevelType w:val="singleLevel"/>
-    <w:tmpl w:val="DB6426B4"/>
+    <w:tmpl w:val="168A265A"/>
     <w:lvl w:ilvl="0">
       <w:start w:val="1"/>
       <w:numFmt w:val="decimal"/>
@@ -4977,7 +4978,7 @@
   <w:abstractNum w:abstractNumId="2" w15:restartNumberingAfterBreak="0">
     <w:nsid w:val="FFFFFF7E"/>
     <w:multiLevelType w:val="singleLevel"/>
-    <w:tmpl w:val="980EB69C"/>
+    <w:tmpl w:val="91642E8C"/>
     <w:lvl w:ilvl="0">
       <w:start w:val="1"/>
       <w:numFmt w:val="decimal"/>
@@ -4994,7 +4995,7 @@
   <w:abstractNum w:abstractNumId="3" w15:restartNumberingAfterBreak="0">
     <w:nsid w:val="FFFFFF7F"/>
     <w:multiLevelType w:val="singleLevel"/>
-    <w:tmpl w:val="428C5C96"/>
+    <w:tmpl w:val="86D4D98C"/>
     <w:lvl w:ilvl="0">
       <w:start w:val="1"/>
       <w:numFmt w:val="decimal"/>
@@ -5011,7 +5012,7 @@
   <w:abstractNum w:abstractNumId="4" w15:restartNumberingAfterBreak="0">
     <w:nsid w:val="FFFFFF80"/>
     <w:multiLevelType w:val="singleLevel"/>
-    <w:tmpl w:val="034A7C7C"/>
+    <w:tmpl w:val="DE8AD354"/>
     <w:lvl w:ilvl="0">
       <w:start w:val="1"/>
       <w:numFmt w:val="bullet"/>
@@ -5031,7 +5032,7 @@
   <w:abstractNum w:abstractNumId="5" w15:restartNumberingAfterBreak="0">
     <w:nsid w:val="FFFFFF81"/>
     <w:multiLevelType w:val="singleLevel"/>
-    <w:tmpl w:val="A412B48C"/>
+    <w:tmpl w:val="BAD2C30A"/>
     <w:lvl w:ilvl="0">
       <w:start w:val="1"/>
       <w:numFmt w:val="bullet"/>
@@ -5051,7 +5052,7 @@
   <w:abstractNum w:abstractNumId="6" w15:restartNumberingAfterBreak="0">
     <w:nsid w:val="FFFFFF82"/>
     <w:multiLevelType w:val="singleLevel"/>
-    <w:tmpl w:val="66680BDE"/>
+    <w:tmpl w:val="2ADA62E0"/>
     <w:lvl w:ilvl="0">
       <w:start w:val="1"/>
       <w:numFmt w:val="bullet"/>
@@ -5071,7 +5072,7 @@
   <w:abstractNum w:abstractNumId="7" w15:restartNumberingAfterBreak="0">
     <w:nsid w:val="FFFFFF83"/>
     <w:multiLevelType w:val="singleLevel"/>
-    <w:tmpl w:val="2FD21302"/>
+    <w:tmpl w:val="74CC5004"/>
     <w:lvl w:ilvl="0">
       <w:start w:val="1"/>
       <w:numFmt w:val="bullet"/>
@@ -5091,7 +5092,7 @@
   <w:abstractNum w:abstractNumId="8" w15:restartNumberingAfterBreak="0">
     <w:nsid w:val="FFFFFF88"/>
     <w:multiLevelType w:val="singleLevel"/>
-    <w:tmpl w:val="F5AE942E"/>
+    <w:tmpl w:val="C130F66E"/>
     <w:lvl w:ilvl="0">
       <w:start w:val="1"/>
       <w:numFmt w:val="decimal"/>
@@ -5108,7 +5109,7 @@
   <w:abstractNum w:abstractNumId="9" w15:restartNumberingAfterBreak="0">
     <w:nsid w:val="FFFFFF89"/>
     <w:multiLevelType w:val="singleLevel"/>
-    <w:tmpl w:val="09B4C3AA"/>
+    <w:tmpl w:val="B8CCEBFA"/>
     <w:lvl w:ilvl="0">
       <w:start w:val="1"/>
       <w:numFmt w:val="bullet"/>
@@ -6834,100 +6835,100 @@
       </w:pPr>
     </w:lvl>
   </w:abstractNum>
-  <w:num w:numId="1" w16cid:durableId="943347431">
+  <w:num w:numId="1">
     <w:abstractNumId w:val="14"/>
   </w:num>
-  <w:num w:numId="2" w16cid:durableId="260727160">
+  <w:num w:numId="2">
     <w:abstractNumId w:val="4"/>
   </w:num>
-  <w:num w:numId="3" w16cid:durableId="228655109">
+  <w:num w:numId="3">
     <w:abstractNumId w:val="5"/>
   </w:num>
-  <w:num w:numId="4" w16cid:durableId="1203712352">
+  <w:num w:numId="4">
     <w:abstractNumId w:val="6"/>
   </w:num>
-  <w:num w:numId="5" w16cid:durableId="1074009583">
+  <w:num w:numId="5">
     <w:abstractNumId w:val="7"/>
   </w:num>
-  <w:num w:numId="6" w16cid:durableId="499394704">
+  <w:num w:numId="6">
     <w:abstractNumId w:val="9"/>
   </w:num>
-  <w:num w:numId="7" w16cid:durableId="697630789">
+  <w:num w:numId="7">
     <w:abstractNumId w:val="0"/>
   </w:num>
-  <w:num w:numId="8" w16cid:durableId="1650355811">
+  <w:num w:numId="8">
     <w:abstractNumId w:val="1"/>
   </w:num>
-  <w:num w:numId="9" w16cid:durableId="1219784065">
+  <w:num w:numId="9">
     <w:abstractNumId w:val="2"/>
   </w:num>
-  <w:num w:numId="10" w16cid:durableId="774442545">
+  <w:num w:numId="10">
     <w:abstractNumId w:val="3"/>
   </w:num>
-  <w:num w:numId="11" w16cid:durableId="291786720">
+  <w:num w:numId="11">
     <w:abstractNumId w:val="8"/>
   </w:num>
-  <w:num w:numId="12" w16cid:durableId="274410646">
+  <w:num w:numId="12">
     <w:abstractNumId w:val="27"/>
   </w:num>
-  <w:num w:numId="13" w16cid:durableId="1472938132">
+  <w:num w:numId="13">
     <w:abstractNumId w:val="25"/>
   </w:num>
-  <w:num w:numId="14" w16cid:durableId="1282302931">
+  <w:num w:numId="14">
     <w:abstractNumId w:val="24"/>
   </w:num>
-  <w:num w:numId="15" w16cid:durableId="71701484">
+  <w:num w:numId="15">
     <w:abstractNumId w:val="22"/>
   </w:num>
-  <w:num w:numId="16" w16cid:durableId="678429756">
+  <w:num w:numId="16">
     <w:abstractNumId w:val="15"/>
   </w:num>
-  <w:num w:numId="17" w16cid:durableId="520826555">
+  <w:num w:numId="17">
     <w:abstractNumId w:val="16"/>
   </w:num>
-  <w:num w:numId="18" w16cid:durableId="1674337299">
+  <w:num w:numId="18">
     <w:abstractNumId w:val="30"/>
   </w:num>
-  <w:num w:numId="19" w16cid:durableId="525753176">
+  <w:num w:numId="19">
     <w:abstractNumId w:val="21"/>
   </w:num>
-  <w:num w:numId="20" w16cid:durableId="698160959">
+  <w:num w:numId="20">
     <w:abstractNumId w:val="28"/>
   </w:num>
-  <w:num w:numId="21" w16cid:durableId="2046129722">
+  <w:num w:numId="21">
     <w:abstractNumId w:val="13"/>
   </w:num>
-  <w:num w:numId="22" w16cid:durableId="901328429">
+  <w:num w:numId="22">
     <w:abstractNumId w:val="17"/>
   </w:num>
-  <w:num w:numId="23" w16cid:durableId="450248700">
+  <w:num w:numId="23">
     <w:abstractNumId w:val="20"/>
   </w:num>
-  <w:num w:numId="24" w16cid:durableId="926112608">
+  <w:num w:numId="24">
     <w:abstractNumId w:val="12"/>
   </w:num>
-  <w:num w:numId="25" w16cid:durableId="1256282875">
+  <w:num w:numId="25">
     <w:abstractNumId w:val="18"/>
   </w:num>
-  <w:num w:numId="26" w16cid:durableId="421417267">
+  <w:num w:numId="26">
     <w:abstractNumId w:val="10"/>
   </w:num>
-  <w:num w:numId="27" w16cid:durableId="1863780656">
+  <w:num w:numId="27">
     <w:abstractNumId w:val="10"/>
   </w:num>
-  <w:num w:numId="28" w16cid:durableId="2064407534">
+  <w:num w:numId="28">
     <w:abstractNumId w:val="11"/>
   </w:num>
-  <w:num w:numId="29" w16cid:durableId="1290821575">
+  <w:num w:numId="29">
     <w:abstractNumId w:val="19"/>
   </w:num>
-  <w:num w:numId="30" w16cid:durableId="559901545">
+  <w:num w:numId="30">
     <w:abstractNumId w:val="26"/>
   </w:num>
-  <w:num w:numId="31" w16cid:durableId="206845032">
+  <w:num w:numId="31">
     <w:abstractNumId w:val="23"/>
   </w:num>
-  <w:num w:numId="32" w16cid:durableId="1548368322">
+  <w:num w:numId="32">
     <w:abstractNumId w:val="29"/>
   </w:num>
 </w:numbering>
@@ -7291,6 +7292,10 @@
   <w:style w:type="paragraph" w:default="1" w:styleId="Normal">
     <w:name w:val="Normal"/>
     <w:qFormat/>
+    <w:rsid w:val="00E45136"/>
+    <w:rPr>
+      <w:rFonts w:ascii="Alegreya Sans" w:hAnsi="Alegreya Sans"/>
+    </w:rPr>
   </w:style>
   <w:style w:type="paragraph" w:styleId="Ttulo1">
     <w:name w:val="heading 1"/>
@@ -7298,7 +7303,7 @@
     <w:next w:val="Textoindependiente"/>
     <w:uiPriority w:val="9"/>
     <w:qFormat/>
-    <w:rsid w:val="00C00CF6"/>
+    <w:rsid w:val="00E45136"/>
     <w:pPr>
       <w:keepNext/>
       <w:keepLines/>
@@ -7311,7 +7316,7 @@
       <w:outlineLvl w:val="0"/>
     </w:pPr>
     <w:rPr>
-      <w:rFonts w:asciiTheme="majorHAnsi" w:eastAsiaTheme="majorEastAsia" w:hAnsiTheme="majorHAnsi" w:cstheme="majorBidi"/>
+      <w:rFonts w:eastAsiaTheme="majorEastAsia" w:cstheme="majorBidi"/>
       <w:b/>
       <w:bCs/>
       <w:color w:val="000000" w:themeColor="text1"/>
@@ -7326,7 +7331,7 @@
     <w:uiPriority w:val="9"/>
     <w:unhideWhenUsed/>
     <w:qFormat/>
-    <w:rsid w:val="00C00CF6"/>
+    <w:rsid w:val="00E45136"/>
     <w:pPr>
       <w:keepNext/>
       <w:keepLines/>
@@ -7339,7 +7344,7 @@
       <w:outlineLvl w:val="1"/>
     </w:pPr>
     <w:rPr>
-      <w:rFonts w:asciiTheme="majorHAnsi" w:eastAsiaTheme="majorEastAsia" w:hAnsiTheme="majorHAnsi" w:cstheme="majorBidi"/>
+      <w:rFonts w:eastAsiaTheme="majorEastAsia" w:cstheme="majorBidi"/>
       <w:b/>
       <w:bCs/>
       <w:i/>
@@ -7356,7 +7361,7 @@
     <w:uiPriority w:val="9"/>
     <w:unhideWhenUsed/>
     <w:qFormat/>
-    <w:rsid w:val="00662F08"/>
+    <w:rsid w:val="00E45136"/>
     <w:pPr>
       <w:keepNext/>
       <w:keepLines/>
@@ -7364,7 +7369,7 @@
       <w:outlineLvl w:val="2"/>
     </w:pPr>
     <w:rPr>
-      <w:rFonts w:asciiTheme="majorHAnsi" w:eastAsiaTheme="majorEastAsia" w:hAnsiTheme="majorHAnsi" w:cstheme="majorBidi"/>
+      <w:rFonts w:eastAsiaTheme="majorEastAsia" w:cstheme="majorBidi"/>
       <w:b/>
       <w:bCs/>
       <w:color w:val="000000" w:themeColor="text1"/>
@@ -7546,18 +7551,21 @@
     <w:basedOn w:val="Normal"/>
     <w:link w:val="TextoindependienteCar"/>
     <w:qFormat/>
-    <w:rsid w:val="005E53A8"/>
+    <w:rsid w:val="00E45136"/>
     <w:pPr>
       <w:spacing w:before="180" w:after="180"/>
       <w:jc w:val="both"/>
     </w:pPr>
+    <w:rPr>
+      <w:rFonts w:ascii="Alegreya" w:hAnsi="Alegreya"/>
+    </w:rPr>
   </w:style>
   <w:style w:type="paragraph" w:customStyle="1" w:styleId="FirstParagraph">
     <w:name w:val="First Paragraph"/>
     <w:basedOn w:val="Textoindependiente"/>
     <w:next w:val="Textoindependiente"/>
     <w:qFormat/>
-    <w:rsid w:val="005E53A8"/>
+    <w:rsid w:val="00E45136"/>
   </w:style>
   <w:style w:type="paragraph" w:customStyle="1" w:styleId="Compact">
     <w:name w:val="Compact"/>
@@ -7572,7 +7580,7 @@
     <w:basedOn w:val="Normal"/>
     <w:next w:val="Textoindependiente"/>
     <w:qFormat/>
-    <w:rsid w:val="009137D8"/>
+    <w:rsid w:val="00E45136"/>
     <w:pPr>
       <w:keepNext/>
       <w:keepLines/>
@@ -7583,7 +7591,7 @@
       <w:jc w:val="center"/>
     </w:pPr>
     <w:rPr>
-      <w:rFonts w:asciiTheme="majorHAnsi" w:eastAsiaTheme="majorEastAsia" w:hAnsiTheme="majorHAnsi" w:cstheme="majorBidi"/>
+      <w:rFonts w:eastAsiaTheme="majorEastAsia" w:cstheme="majorBidi"/>
       <w:b/>
       <w:bCs/>
       <w:color w:val="000000" w:themeColor="text1"/>
@@ -7612,21 +7620,29 @@
     <w:name w:val="Author"/>
     <w:next w:val="Textoindependiente"/>
     <w:qFormat/>
+    <w:rsid w:val="00E45136"/>
     <w:pPr>
       <w:keepNext/>
       <w:keepLines/>
       <w:jc w:val="center"/>
     </w:pPr>
+    <w:rPr>
+      <w:rFonts w:ascii="Alegreya Sans" w:hAnsi="Alegreya Sans"/>
+    </w:rPr>
   </w:style>
   <w:style w:type="paragraph" w:styleId="Fecha">
     <w:name w:val="Date"/>
     <w:next w:val="Textoindependiente"/>
     <w:qFormat/>
+    <w:rsid w:val="00E45136"/>
     <w:pPr>
       <w:keepNext/>
       <w:keepLines/>
       <w:jc w:val="center"/>
     </w:pPr>
+    <w:rPr>
+      <w:rFonts w:ascii="Alegreya Sans" w:hAnsi="Alegreya Sans"/>
+    </w:rPr>
   </w:style>
   <w:style w:type="paragraph" w:customStyle="1" w:styleId="Abstract">
     <w:name w:val="Abstract"/>
@@ -7777,7 +7793,7 @@
   <w:style w:type="paragraph" w:customStyle="1" w:styleId="TableCaption">
     <w:name w:val="Table Caption"/>
     <w:basedOn w:val="Descripcin"/>
-    <w:rsid w:val="009137D8"/>
+    <w:rsid w:val="00E45136"/>
     <w:pPr>
       <w:keepNext/>
       <w:jc w:val="center"/>
@@ -7786,7 +7802,7 @@
   <w:style w:type="paragraph" w:customStyle="1" w:styleId="ImageCaption">
     <w:name w:val="Image Caption"/>
     <w:basedOn w:val="Descripcin"/>
-    <w:rsid w:val="00CD4DBF"/>
+    <w:rsid w:val="00E45136"/>
     <w:pPr>
       <w:jc w:val="center"/>
     </w:pPr>
@@ -7836,9 +7852,9 @@
     <w:name w:val="Hyperlink"/>
     <w:basedOn w:val="DescripcinCar"/>
     <w:uiPriority w:val="99"/>
-    <w:rsid w:val="009137D8"/>
+    <w:rsid w:val="00B02805"/>
     <w:rPr>
-      <w:color w:val="C00000"/>
+      <w:color w:val="943634" w:themeColor="accent2" w:themeShade="BF"/>
     </w:rPr>
   </w:style>
   <w:style w:type="paragraph" w:styleId="TtuloTDC">
@@ -7848,7 +7864,7 @@
     <w:uiPriority w:val="39"/>
     <w:unhideWhenUsed/>
     <w:qFormat/>
-    <w:rsid w:val="00662F08"/>
+    <w:rsid w:val="00E45136"/>
     <w:pPr>
       <w:numPr>
         <w:numId w:val="0"/>
@@ -7865,7 +7881,10 @@
     <w:name w:val="Texto independiente Car"/>
     <w:basedOn w:val="Fuentedeprrafopredeter"/>
     <w:link w:val="Textoindependiente"/>
-    <w:rsid w:val="005E53A8"/>
+    <w:rsid w:val="00E45136"/>
+    <w:rPr>
+      <w:rFonts w:ascii="Alegreya" w:hAnsi="Alegreya"/>
+    </w:rPr>
   </w:style>
   <w:style w:type="paragraph" w:styleId="Prrafodelista">
     <w:name w:val="List Paragraph"/>
@@ -7923,7 +7942,10 @@
     <w:basedOn w:val="Fuentedeprrafopredeter"/>
     <w:semiHidden/>
     <w:unhideWhenUsed/>
-    <w:rsid w:val="00676DF8"/>
+    <w:rsid w:val="00E45136"/>
+    <w:rPr>
+      <w:rFonts w:ascii="Alegreya Sans" w:hAnsi="Alegreya Sans"/>
+    </w:rPr>
   </w:style>
   <w:style w:type="paragraph" w:styleId="Encabezado">
     <w:name w:val="header"/>
@@ -8407,6 +8429,30 @@
       <w:lang w:val="es-AR" w:eastAsia="es-AR"/>
     </w:rPr>
   </w:style>
+  <w:style w:type="paragraph" w:styleId="ndice1">
+    <w:name w:val="index 1"/>
+    <w:basedOn w:val="Normal"/>
+    <w:next w:val="Normal"/>
+    <w:autoRedefine/>
+    <w:rsid w:val="00B02805"/>
+    <w:pPr>
+      <w:spacing w:after="0"/>
+      <w:ind w:left="240" w:hanging="240"/>
+    </w:pPr>
+  </w:style>
+  <w:style w:type="paragraph" w:styleId="Ttulodendice">
+    <w:name w:val="index heading"/>
+    <w:basedOn w:val="Normal"/>
+    <w:next w:val="ndice1"/>
+    <w:semiHidden/>
+    <w:unhideWhenUsed/>
+    <w:rsid w:val="00B02805"/>
+    <w:rPr>
+      <w:rFonts w:asciiTheme="majorHAnsi" w:eastAsiaTheme="majorEastAsia" w:hAnsiTheme="majorHAnsi" w:cstheme="majorBidi"/>
+      <w:b/>
+      <w:bCs/>
+    </w:rPr>
+  </w:style>
 </w:styles>
 </file>
 

</xml_diff>